<commit_message>
some adjustments and cvs
</commit_message>
<xml_diff>
--- a/_Career_Intelligence_System/downloads/JOBS/USIU Africa/Meshack Ariri CV.docx
+++ b/_Career_Intelligence_System/downloads/JOBS/USIU Africa/Meshack Ariri CV.docx
@@ -2,249 +2,139 @@
 <file path=word/document.xml><?xml version="1.0" encoding="utf-8"?>
 <w:document xmlns:wpc="http://schemas.microsoft.com/office/word/2010/wordprocessingCanvas" xmlns:mo="http://schemas.microsoft.com/office/mac/office/2008/main" xmlns:mc="http://schemas.openxmlformats.org/markup-compatibility/2006" xmlns:mv="urn:schemas-microsoft-com:mac:vml" xmlns:o="urn:schemas-microsoft-com:office:office" xmlns:r="http://schemas.openxmlformats.org/officeDocument/2006/relationships" xmlns:m="http://schemas.openxmlformats.org/officeDocument/2006/math" xmlns:v="urn:schemas-microsoft-com:vml" xmlns:wp14="http://schemas.microsoft.com/office/word/2010/wordprocessingDrawing" xmlns:wp="http://schemas.openxmlformats.org/drawingml/2006/wordprocessingDrawing" xmlns:w10="urn:schemas-microsoft-com:office:word" xmlns:w="http://schemas.openxmlformats.org/wordprocessingml/2006/main" xmlns:w14="http://schemas.microsoft.com/office/word/2010/wordml" xmlns:wpg="http://schemas.microsoft.com/office/word/2010/wordprocessingGroup" xmlns:wpi="http://schemas.microsoft.com/office/word/2010/wordprocessingInk" xmlns:wne="http://schemas.microsoft.com/office/word/2006/wordml" xmlns:wps="http://schemas.microsoft.com/office/word/2010/wordprocessingShape" mc:Ignorable="w14 wp14">
   <w:body>
-    <w:tbl>
-      <w:tblPr>
-        <w:tblW w:type="auto" w:w="0"/>
-        <w:tblLook w:firstColumn="1" w:firstRow="1" w:lastColumn="0" w:lastRow="0" w:noHBand="0" w:noVBand="1" w:val="04A0"/>
-        <w:tblW w:w="9849" w:type="dxa"/>
-        <w:tblBorders>
-          <w:top w:val="nil"/>
-          <w:left w:val="nil"/>
-          <w:bottom w:val="nil"/>
-          <w:right w:val="nil"/>
-          <w:insideH w:val="nil"/>
-          <w:insideV w:val="nil"/>
-        </w:tblBorders>
-      </w:tblPr>
-      <w:tblGrid>
-        <w:gridCol w:w="10570"/>
-      </w:tblGrid>
-      <w:tr>
-        <w:tc>
-          <w:tcPr>
-            <w:tcW w:type="dxa" w:w="10570"/>
-            <w:shd w:val="clear" w:color="auto" w:fill="2A2478"/>
-          </w:tcPr>
-          <w:p>
-            <w:pPr>
-              <w:spacing w:after="0" w:before="0"/>
-            </w:pPr>
-            <w:r>
-              <w:rPr>
-                <w:sz w:val="6"/>
-              </w:rPr>
-              <w:t xml:space="preserve"> </w:t>
-            </w:r>
-          </w:p>
-        </w:tc>
-      </w:tr>
-    </w:tbl>
-    <w:tbl>
-      <w:tblPr>
-        <w:tblW w:type="auto" w:w="0"/>
-        <w:tblLook w:firstColumn="1" w:firstRow="1" w:lastColumn="0" w:lastRow="0" w:noHBand="0" w:noVBand="1" w:val="04A0"/>
-        <w:tblW w:w="9849" w:type="dxa"/>
-        <w:tblBorders>
-          <w:top w:val="nil"/>
-          <w:left w:val="nil"/>
-          <w:bottom w:val="nil"/>
-          <w:right w:val="nil"/>
-          <w:insideH w:val="nil"/>
-          <w:insideV w:val="nil"/>
-        </w:tblBorders>
-      </w:tblPr>
-      <w:tblGrid>
-        <w:gridCol w:w="10570"/>
-      </w:tblGrid>
-      <w:tr>
-        <w:tc>
-          <w:tcPr>
-            <w:tcW w:type="dxa" w:w="10570"/>
-            <w:shd w:val="clear" w:color="auto" w:fill="ECEDFB"/>
-            <w:vAlign w:val="center"/>
-          </w:tcPr>
-          <w:p/>
-          <w:p>
-            <w:pPr>
-              <w:spacing w:before="200" w:after="80"/>
-              <w:jc w:val="center"/>
-            </w:pPr>
-            <w:r>
-              <w:rPr>
-                <w:rFonts w:ascii="Calibri" w:hAnsi="Calibri"/>
-                <w:b/>
-                <w:color w:val="2A2478"/>
-                <w:sz w:val="52"/>
-              </w:rPr>
-              <w:t>MESHACK ARIRI</w:t>
-            </w:r>
-          </w:p>
-          <w:p>
-            <w:pPr>
-              <w:spacing w:after="120"/>
-              <w:jc w:val="center"/>
-            </w:pPr>
-            <w:r>
-              <w:rPr>
-                <w:rFonts w:ascii="Calibri" w:hAnsi="Calibri"/>
-                <w:color w:val="1E293B"/>
-                <w:sz w:val="20"/>
-              </w:rPr>
-              <w:t>ICT Officer  |  Service Desk · Microsoft 365 · Networking · ITSM  |  University &amp; Multi-Site Support</w:t>
-            </w:r>
-          </w:p>
-          <w:p>
-            <w:pPr>
-              <w:spacing w:after="40"/>
-              <w:jc w:val="center"/>
-            </w:pPr>
-            <w:r>
-              <w:rPr>
-                <w:rFonts w:ascii="Calibri" w:hAnsi="Calibri"/>
-                <w:color w:val="64748B"/>
-                <w:sz w:val="16"/>
-              </w:rPr>
-              <w:t>Nairobi / Kisumu, Kenya</w:t>
-            </w:r>
-            <w:r>
-              <w:rPr>
-                <w:rFonts w:ascii="Calibri" w:hAnsi="Calibri"/>
-                <w:color w:val="6366F1"/>
-                <w:sz w:val="16"/>
-              </w:rPr>
-              <w:t xml:space="preserve">  |  </w:t>
-            </w:r>
-            <w:r>
-              <w:rPr>
-                <w:rFonts w:ascii="Calibri" w:hAnsi="Calibri"/>
-                <w:color w:val="64748B"/>
-                <w:sz w:val="16"/>
-              </w:rPr>
-              <w:t>+254 741 174 779</w:t>
-            </w:r>
-            <w:r>
-              <w:rPr>
-                <w:rFonts w:ascii="Calibri" w:hAnsi="Calibri"/>
-                <w:color w:val="6366F1"/>
-                <w:sz w:val="16"/>
-              </w:rPr>
-              <w:t xml:space="preserve">  |  </w:t>
-            </w:r>
-            <w:r>
-              <w:rPr>
-                <w:rFonts w:ascii="Calibri" w:hAnsi="Calibri"/>
-                <w:color w:val="64748B"/>
-                <w:sz w:val="16"/>
-              </w:rPr>
-              <w:t>aririmeshack@gmail.com</w:t>
-            </w:r>
-          </w:p>
-          <w:p>
-            <w:pPr>
-              <w:spacing w:after="40"/>
-              <w:jc w:val="center"/>
-            </w:pPr>
-            <w:r>
-              <w:rPr>
-                <w:rFonts w:ascii="Calibri" w:hAnsi="Calibri"/>
-                <w:color w:val="64748B"/>
-                <w:sz w:val="16"/>
-              </w:rPr>
-              <w:t>linkedin.com/in/meshack-ariri</w:t>
-            </w:r>
-            <w:r>
-              <w:rPr>
-                <w:rFonts w:ascii="Calibri" w:hAnsi="Calibri"/>
-                <w:color w:val="6366F1"/>
-                <w:sz w:val="16"/>
-              </w:rPr>
-              <w:t xml:space="preserve">  |  </w:t>
-            </w:r>
-            <w:r>
-              <w:rPr>
-                <w:rFonts w:ascii="Calibri" w:hAnsi="Calibri"/>
-                <w:color w:val="64748B"/>
-                <w:sz w:val="16"/>
-              </w:rPr>
-              <w:t>meshreallycodes.online</w:t>
-            </w:r>
-          </w:p>
-          <w:p>
-            <w:pPr>
-              <w:spacing w:after="200"/>
-            </w:pPr>
-          </w:p>
-        </w:tc>
-      </w:tr>
-    </w:tbl>
     <w:p>
       <w:pPr>
-        <w:spacing w:before="80" w:after="160"/>
-        <w:pBdr>
-          <w:bottom w:val="single" w:sz="16" w:space="1" w:color="3730A3"/>
-        </w:pBdr>
+        <w:spacing w:before="40" w:after="40"/>
+        <w:jc w:val="left"/>
       </w:pPr>
+      <w:r>
+        <w:rPr>
+          <w:rFonts w:ascii="Calibri" w:hAnsi="Calibri"/>
+          <w:b/>
+          <w:color w:val="0F2744"/>
+          <w:sz w:val="44"/>
+        </w:rPr>
+        <w:t>MESHACK ARIRI</w:t>
+      </w:r>
     </w:p>
-    <w:tbl>
-      <w:tblPr>
-        <w:tblW w:type="auto" w:w="0"/>
-        <w:tblLook w:firstColumn="1" w:firstRow="1" w:lastColumn="0" w:lastRow="0" w:noHBand="0" w:noVBand="1" w:val="04A0"/>
-        <w:tblW w:w="9849" w:type="dxa"/>
-        <w:tblBorders>
-          <w:top w:val="nil"/>
-          <w:left w:val="nil"/>
-          <w:bottom w:val="nil"/>
-          <w:right w:val="nil"/>
-          <w:insideH w:val="nil"/>
-          <w:insideV w:val="nil"/>
-        </w:tblBorders>
-      </w:tblPr>
-      <w:tblGrid>
-        <w:gridCol w:w="5285"/>
-        <w:gridCol w:w="5285"/>
-      </w:tblGrid>
-      <w:tr>
-        <w:tc>
-          <w:tcPr>
-            <w:tcW w:type="dxa" w:w="173"/>
-            <w:shd w:val="clear" w:color="auto" w:fill="3730A3"/>
-          </w:tcPr>
-          <w:p/>
-        </w:tc>
-        <w:tc>
-          <w:tcPr>
-            <w:tcW w:type="dxa" w:w="9677"/>
-            <w:shd w:val="clear" w:color="auto" w:fill="F6F6FD"/>
-          </w:tcPr>
-          <w:p>
-            <w:pPr>
-              <w:spacing w:before="100" w:after="100"/>
-              <w:ind w:left="115"/>
-            </w:pPr>
-            <w:r>
-              <w:rPr>
-                <w:rFonts w:ascii="Calibri" w:hAnsi="Calibri"/>
-                <w:b/>
-                <w:color w:val="2A2478"/>
-                <w:sz w:val="21"/>
-              </w:rPr>
-              <w:t>PROFESSIONAL SUMMARY</w:t>
-            </w:r>
-          </w:p>
-        </w:tc>
-      </w:tr>
-    </w:tbl>
     <w:p>
       <w:pPr>
-        <w:spacing w:before="0" w:after="120"/>
+        <w:spacing w:after="60"/>
+        <w:jc w:val="left"/>
+      </w:pPr>
+      <w:r>
+        <w:rPr>
+          <w:rFonts w:ascii="Calibri" w:hAnsi="Calibri"/>
+          <w:color w:val="3D4F63"/>
+          <w:sz w:val="20"/>
+        </w:rPr>
+        <w:t>ICT Officer  |  Service Desk · Microsoft 365 · Networking · ITSM  |  University &amp; Multi-Site Support</w:t>
+      </w:r>
+    </w:p>
+    <w:p>
+      <w:pPr>
+        <w:spacing w:after="20"/>
+        <w:jc w:val="left"/>
+      </w:pPr>
+      <w:r>
+        <w:rPr>
+          <w:rFonts w:ascii="Calibri" w:hAnsi="Calibri"/>
+          <w:color w:val="64748B"/>
+          <w:sz w:val="16"/>
+        </w:rPr>
+        <w:t>Nairobi / Kisumu, Kenya</w:t>
+      </w:r>
+      <w:r>
+        <w:rPr>
+          <w:rFonts w:ascii="Calibri" w:hAnsi="Calibri"/>
+          <w:color w:val="64748B"/>
+          <w:sz w:val="16"/>
+        </w:rPr>
+        <w:t xml:space="preserve">  ·  </w:t>
+      </w:r>
+      <w:r>
+        <w:rPr>
+          <w:rFonts w:ascii="Calibri" w:hAnsi="Calibri"/>
+          <w:color w:val="64748B"/>
+          <w:sz w:val="16"/>
+        </w:rPr>
+        <w:t>+254 741 174 779</w:t>
+      </w:r>
+      <w:r>
+        <w:rPr>
+          <w:rFonts w:ascii="Calibri" w:hAnsi="Calibri"/>
+          <w:color w:val="64748B"/>
+          <w:sz w:val="16"/>
+        </w:rPr>
+        <w:t xml:space="preserve">  ·  </w:t>
+      </w:r>
+      <w:r>
+        <w:rPr>
+          <w:rFonts w:ascii="Calibri" w:hAnsi="Calibri"/>
+          <w:color w:val="64748B"/>
+          <w:sz w:val="16"/>
+        </w:rPr>
+        <w:t>aririmeshack@gmail.com</w:t>
+      </w:r>
+    </w:p>
+    <w:p>
+      <w:pPr>
+        <w:spacing w:after="20"/>
+        <w:jc w:val="left"/>
+      </w:pPr>
+      <w:r>
+        <w:rPr>
+          <w:rFonts w:ascii="Calibri" w:hAnsi="Calibri"/>
+          <w:color w:val="64748B"/>
+          <w:sz w:val="16"/>
+        </w:rPr>
+        <w:t>linkedin.com/in/meshack-ariri</w:t>
+      </w:r>
+      <w:r>
+        <w:rPr>
+          <w:rFonts w:ascii="Calibri" w:hAnsi="Calibri"/>
+          <w:color w:val="64748B"/>
+          <w:sz w:val="16"/>
+        </w:rPr>
+        <w:t xml:space="preserve">  ·  </w:t>
+      </w:r>
+      <w:r>
+        <w:rPr>
+          <w:rFonts w:ascii="Calibri" w:hAnsi="Calibri"/>
+          <w:color w:val="64748B"/>
+          <w:sz w:val="16"/>
+        </w:rPr>
+        <w:t>meshreallycodes.online</w:t>
+      </w:r>
+    </w:p>
+    <w:p>
+      <w:pPr>
+        <w:spacing w:before="80" w:after="120"/>
         <w:pBdr>
-          <w:bottom w:val="single" w:sz="4" w:space="1" w:color="6366F1"/>
+          <w:bottom w:val="single" w:sz="18" w:space="1" w:color="C45C26"/>
         </w:pBdr>
       </w:pPr>
     </w:p>
     <w:p>
       <w:pPr>
-        <w:spacing w:after="80"/>
+        <w:spacing w:before="160" w:after="20"/>
+        <w:pBdr>
+          <w:bottom w:val="single" w:sz="12" w:space="1" w:color="C45C26"/>
+        </w:pBdr>
+      </w:pPr>
+      <w:r>
+        <w:rPr>
+          <w:rFonts w:ascii="Calibri" w:hAnsi="Calibri"/>
+          <w:b/>
+          <w:color w:val="0F2744"/>
+          <w:sz w:val="18"/>
+        </w:rPr>
+        <w:t>PROFILE</w:t>
+      </w:r>
+    </w:p>
+    <w:p>
+      <w:pPr>
+        <w:spacing w:after="120"/>
       </w:pPr>
       <w:r>
         <w:rPr>
@@ -260,7 +150,7 @@
       <w:tblPr>
         <w:tblW w:type="auto" w:w="0"/>
         <w:tblLook w:firstColumn="1" w:firstRow="1" w:lastColumn="0" w:lastRow="0" w:noHBand="0" w:noVBand="1" w:val="04A0"/>
-        <w:tblW w:w="9849" w:type="dxa"/>
+        <w:tblW w:w="10166" w:type="dxa"/>
         <w:tblBorders>
           <w:top w:val="nil"/>
           <w:left w:val="nil"/>
@@ -271,35 +161,152 @@
         </w:tblBorders>
       </w:tblPr>
       <w:tblGrid>
-        <w:gridCol w:w="5285"/>
-        <w:gridCol w:w="5285"/>
+        <w:gridCol w:w="5371"/>
+        <w:gridCol w:w="5371"/>
       </w:tblGrid>
       <w:tr>
         <w:tc>
           <w:tcPr>
             <w:tcW w:type="dxa" w:w="173"/>
-            <w:shd w:val="clear" w:color="auto" w:fill="3730A3"/>
+            <w:shd w:val="clear" w:color="auto" w:fill="C45C26"/>
           </w:tcPr>
           <w:p/>
         </w:tc>
         <w:tc>
           <w:tcPr>
-            <w:tcW w:type="dxa" w:w="9677"/>
-            <w:shd w:val="clear" w:color="auto" w:fill="F6F6FD"/>
+            <w:tcW w:type="dxa" w:w="9994"/>
+            <w:shd w:val="clear" w:color="auto" w:fill="FBF7F2"/>
           </w:tcPr>
           <w:p>
             <w:pPr>
-              <w:spacing w:before="100" w:after="100"/>
-              <w:ind w:left="115"/>
+              <w:spacing w:before="20" w:after="20"/>
             </w:pPr>
             <w:r>
               <w:rPr>
                 <w:rFonts w:ascii="Calibri" w:hAnsi="Calibri"/>
                 <w:b/>
-                <w:color w:val="2A2478"/>
-                <w:sz w:val="21"/>
+                <w:color w:val="C45C26"/>
+                <w:sz w:val="17"/>
               </w:rPr>
-              <w:t>CORE SKILLS</w:t>
+              <w:t xml:space="preserve">Service Desk &amp; ITSM  </w:t>
+            </w:r>
+            <w:r>
+              <w:rPr>
+                <w:rFonts w:ascii="Calibri" w:hAnsi="Calibri"/>
+                <w:color w:val="1E293B"/>
+                <w:sz w:val="17"/>
+              </w:rPr>
+              <w:t>1st-line support, walk-in/phone/email/ticket channels, Freshdesk, Zoho Desk, Jira Service Management, ITIL, SLA, incident logging, knowledge base</w:t>
+            </w:r>
+          </w:p>
+          <w:p>
+            <w:pPr>
+              <w:spacing w:before="20" w:after="20"/>
+            </w:pPr>
+            <w:r>
+              <w:rPr>
+                <w:rFonts w:ascii="Calibri" w:hAnsi="Calibri"/>
+                <w:b/>
+                <w:color w:val="C45C26"/>
+                <w:sz w:val="17"/>
+              </w:rPr>
+              <w:t xml:space="preserve">Windows &amp; Microsoft 365  </w:t>
+            </w:r>
+            <w:r>
+              <w:rPr>
+                <w:rFonts w:ascii="Calibri" w:hAnsi="Calibri"/>
+                <w:color w:val="1E293B"/>
+                <w:sz w:val="17"/>
+              </w:rPr>
+              <w:t>Windows 10/11, Microsoft 365 Admin (Outlook, Teams, SharePoint), Active Directory / Entra ID, MFA, onboarding/offboarding, Group Policy basics</w:t>
+            </w:r>
+          </w:p>
+          <w:p>
+            <w:pPr>
+              <w:spacing w:before="20" w:after="20"/>
+            </w:pPr>
+            <w:r>
+              <w:rPr>
+                <w:rFonts w:ascii="Calibri" w:hAnsi="Calibri"/>
+                <w:b/>
+                <w:color w:val="C45C26"/>
+                <w:sz w:val="17"/>
+              </w:rPr>
+              <w:t xml:space="preserve">Networking &amp; Infrastructure  </w:t>
+            </w:r>
+            <w:r>
+              <w:rPr>
+                <w:rFonts w:ascii="Calibri" w:hAnsi="Calibri"/>
+                <w:color w:val="1E293B"/>
+                <w:sz w:val="17"/>
+              </w:rPr>
+              <w:t>LAN/WAN, TCP/IP, DNS, DHCP, VLANs, VPN, Wi-Fi, Cisco Meraki, switches/routers, monitoring and escalation</w:t>
+            </w:r>
+          </w:p>
+          <w:p>
+            <w:pPr>
+              <w:spacing w:before="20" w:after="20"/>
+            </w:pPr>
+            <w:r>
+              <w:rPr>
+                <w:rFonts w:ascii="Calibri" w:hAnsi="Calibri"/>
+                <w:b/>
+                <w:color w:val="C45C26"/>
+                <w:sz w:val="17"/>
+              </w:rPr>
+              <w:t xml:space="preserve">Security &amp; Compliance  </w:t>
+            </w:r>
+            <w:r>
+              <w:rPr>
+                <w:rFonts w:ascii="Calibri" w:hAnsi="Calibri"/>
+                <w:color w:val="1E293B"/>
+                <w:sz w:val="17"/>
+              </w:rPr>
+              <w:t>Endpoint protection, antivirus/patching, MFA/IAM, least-privilege access, security awareness, access logging; Kenya DPA awareness</w:t>
+            </w:r>
+          </w:p>
+          <w:p>
+            <w:pPr>
+              <w:spacing w:before="20" w:after="20"/>
+            </w:pPr>
+            <w:r>
+              <w:rPr>
+                <w:rFonts w:ascii="Calibri" w:hAnsi="Calibri"/>
+                <w:b/>
+                <w:color w:val="C45C26"/>
+                <w:sz w:val="17"/>
+              </w:rPr>
+              <w:t xml:space="preserve">Assets, AV &amp; Continuity  </w:t>
+            </w:r>
+            <w:r>
+              <w:rPr>
+                <w:rFonts w:ascii="Calibri" w:hAnsi="Calibri"/>
+                <w:color w:val="1E293B"/>
+                <w:sz w:val="17"/>
+              </w:rPr>
+              <w:t>ICT asset inventory/tagging, license tracking (M365), backups &amp; DR logs, VoIP/AV and training-venue setup support</w:t>
+            </w:r>
+          </w:p>
+          <w:p>
+            <w:pPr>
+              <w:spacing w:before="20" w:after="20"/>
+            </w:pPr>
+            <w:r>
+              <w:rPr>
+                <w:rFonts w:ascii="Calibri" w:hAnsi="Calibri"/>
+                <w:b/>
+                <w:color w:val="C45C26"/>
+                <w:sz w:val="17"/>
+              </w:rPr>
+              <w:t xml:space="preserve">Enterprise apps &amp; data  </w:t>
+            </w:r>
+            <w:r>
+              <w:rPr>
+                <w:rFonts w:ascii="Calibri" w:hAnsi="Calibri"/>
+                <w:color w:val="1E293B"/>
+                <w:sz w:val="17"/>
+              </w:rPr>
+              <w:t>Rapid adoption of line-of-business systems; KenyaEMR/DHIS2 support experience; SQL reporting; documentation/SOPs</w:t>
             </w:r>
           </w:p>
         </w:tc>
@@ -307,206 +314,25 @@
     </w:tbl>
     <w:p>
       <w:pPr>
-        <w:spacing w:before="0" w:after="120"/>
-        <w:pBdr>
-          <w:bottom w:val="single" w:sz="4" w:space="1" w:color="6366F1"/>
-        </w:pBdr>
+        <w:spacing w:after="80"/>
       </w:pPr>
     </w:p>
     <w:p>
       <w:pPr>
-        <w:spacing w:after="60"/>
-        <w:ind w:left="58"/>
+        <w:spacing w:before="160" w:after="20"/>
+        <w:pBdr>
+          <w:bottom w:val="single" w:sz="12" w:space="1" w:color="C45C26"/>
+        </w:pBdr>
       </w:pPr>
       <w:r>
         <w:rPr>
           <w:rFonts w:ascii="Calibri" w:hAnsi="Calibri"/>
           <w:b/>
-          <w:color w:val="3730A3"/>
+          <w:color w:val="0F2744"/>
           <w:sz w:val="18"/>
         </w:rPr>
-        <w:t xml:space="preserve">Service Desk &amp; ITSM: </w:t>
+        <w:t>EXPERIENCE</w:t>
       </w:r>
-      <w:r>
-        <w:rPr>
-          <w:rFonts w:ascii="Calibri" w:hAnsi="Calibri"/>
-          <w:color w:val="1E293B"/>
-          <w:sz w:val="18"/>
-        </w:rPr>
-        <w:t>1st-line support, walk-in/phone/email/ticket channels, Freshdesk, Zoho Desk, Jira Service Management, ITIL, SLA, incident logging, knowledge base</w:t>
-      </w:r>
-    </w:p>
-    <w:p>
-      <w:pPr>
-        <w:spacing w:after="60"/>
-        <w:ind w:left="58"/>
-      </w:pPr>
-      <w:r>
-        <w:rPr>
-          <w:rFonts w:ascii="Calibri" w:hAnsi="Calibri"/>
-          <w:b/>
-          <w:color w:val="3730A3"/>
-          <w:sz w:val="18"/>
-        </w:rPr>
-        <w:t xml:space="preserve">Windows &amp; Microsoft 365: </w:t>
-      </w:r>
-      <w:r>
-        <w:rPr>
-          <w:rFonts w:ascii="Calibri" w:hAnsi="Calibri"/>
-          <w:color w:val="1E293B"/>
-          <w:sz w:val="18"/>
-        </w:rPr>
-        <w:t>Windows 10/11, Microsoft 365 Admin (Outlook, Teams, SharePoint), Active Directory / Entra ID, MFA, onboarding/offboarding, Group Policy basics</w:t>
-      </w:r>
-    </w:p>
-    <w:p>
-      <w:pPr>
-        <w:spacing w:after="60"/>
-        <w:ind w:left="58"/>
-      </w:pPr>
-      <w:r>
-        <w:rPr>
-          <w:rFonts w:ascii="Calibri" w:hAnsi="Calibri"/>
-          <w:b/>
-          <w:color w:val="3730A3"/>
-          <w:sz w:val="18"/>
-        </w:rPr>
-        <w:t xml:space="preserve">Networking &amp; Infrastructure: </w:t>
-      </w:r>
-      <w:r>
-        <w:rPr>
-          <w:rFonts w:ascii="Calibri" w:hAnsi="Calibri"/>
-          <w:color w:val="1E293B"/>
-          <w:sz w:val="18"/>
-        </w:rPr>
-        <w:t>LAN/WAN, TCP/IP, DNS, DHCP, VLANs, VPN, Wi-Fi, Cisco Meraki, switches/routers, monitoring and escalation</w:t>
-      </w:r>
-    </w:p>
-    <w:p>
-      <w:pPr>
-        <w:spacing w:after="60"/>
-        <w:ind w:left="58"/>
-      </w:pPr>
-      <w:r>
-        <w:rPr>
-          <w:rFonts w:ascii="Calibri" w:hAnsi="Calibri"/>
-          <w:b/>
-          <w:color w:val="3730A3"/>
-          <w:sz w:val="18"/>
-        </w:rPr>
-        <w:t xml:space="preserve">Security &amp; Compliance: </w:t>
-      </w:r>
-      <w:r>
-        <w:rPr>
-          <w:rFonts w:ascii="Calibri" w:hAnsi="Calibri"/>
-          <w:color w:val="1E293B"/>
-          <w:sz w:val="18"/>
-        </w:rPr>
-        <w:t>Endpoint protection, antivirus/patching, MFA/IAM, least-privilege access, security awareness, access logging; Kenya DPA awareness</w:t>
-      </w:r>
-    </w:p>
-    <w:p>
-      <w:pPr>
-        <w:spacing w:after="60"/>
-        <w:ind w:left="58"/>
-      </w:pPr>
-      <w:r>
-        <w:rPr>
-          <w:rFonts w:ascii="Calibri" w:hAnsi="Calibri"/>
-          <w:b/>
-          <w:color w:val="3730A3"/>
-          <w:sz w:val="18"/>
-        </w:rPr>
-        <w:t xml:space="preserve">Assets, AV &amp; Continuity: </w:t>
-      </w:r>
-      <w:r>
-        <w:rPr>
-          <w:rFonts w:ascii="Calibri" w:hAnsi="Calibri"/>
-          <w:color w:val="1E293B"/>
-          <w:sz w:val="18"/>
-        </w:rPr>
-        <w:t>ICT asset inventory/tagging, license tracking (M365), backups &amp; DR logs, VoIP/AV and training-venue setup support</w:t>
-      </w:r>
-    </w:p>
-    <w:p>
-      <w:pPr>
-        <w:spacing w:after="60"/>
-        <w:ind w:left="58"/>
-      </w:pPr>
-      <w:r>
-        <w:rPr>
-          <w:rFonts w:ascii="Calibri" w:hAnsi="Calibri"/>
-          <w:b/>
-          <w:color w:val="3730A3"/>
-          <w:sz w:val="18"/>
-        </w:rPr>
-        <w:t xml:space="preserve">Enterprise apps &amp; data: </w:t>
-      </w:r>
-      <w:r>
-        <w:rPr>
-          <w:rFonts w:ascii="Calibri" w:hAnsi="Calibri"/>
-          <w:color w:val="1E293B"/>
-          <w:sz w:val="18"/>
-        </w:rPr>
-        <w:t>Rapid adoption of line-of-business systems; KenyaEMR/DHIS2 support experience; SQL reporting; documentation/SOPs</w:t>
-      </w:r>
-    </w:p>
-    <w:tbl>
-      <w:tblPr>
-        <w:tblW w:type="auto" w:w="0"/>
-        <w:tblLook w:firstColumn="1" w:firstRow="1" w:lastColumn="0" w:lastRow="0" w:noHBand="0" w:noVBand="1" w:val="04A0"/>
-        <w:tblW w:w="9849" w:type="dxa"/>
-        <w:tblBorders>
-          <w:top w:val="nil"/>
-          <w:left w:val="nil"/>
-          <w:bottom w:val="nil"/>
-          <w:right w:val="nil"/>
-          <w:insideH w:val="nil"/>
-          <w:insideV w:val="nil"/>
-        </w:tblBorders>
-      </w:tblPr>
-      <w:tblGrid>
-        <w:gridCol w:w="5285"/>
-        <w:gridCol w:w="5285"/>
-      </w:tblGrid>
-      <w:tr>
-        <w:tc>
-          <w:tcPr>
-            <w:tcW w:type="dxa" w:w="173"/>
-            <w:shd w:val="clear" w:color="auto" w:fill="3730A3"/>
-          </w:tcPr>
-          <w:p/>
-        </w:tc>
-        <w:tc>
-          <w:tcPr>
-            <w:tcW w:type="dxa" w:w="9677"/>
-            <w:shd w:val="clear" w:color="auto" w:fill="F6F6FD"/>
-          </w:tcPr>
-          <w:p>
-            <w:pPr>
-              <w:spacing w:before="100" w:after="100"/>
-              <w:ind w:left="115"/>
-            </w:pPr>
-            <w:r>
-              <w:rPr>
-                <w:rFonts w:ascii="Calibri" w:hAnsi="Calibri"/>
-                <w:b/>
-                <w:color w:val="2A2478"/>
-                <w:sz w:val="21"/>
-              </w:rPr>
-              <w:t>PROFESSIONAL EXPERIENCE</w:t>
-            </w:r>
-          </w:p>
-        </w:tc>
-      </w:tr>
-    </w:tbl>
-    <w:p>
-      <w:pPr>
-        <w:spacing w:before="0" w:after="120"/>
-        <w:pBdr>
-          <w:bottom w:val="single" w:sz="4" w:space="1" w:color="6366F1"/>
-        </w:pBdr>
-      </w:pPr>
     </w:p>
     <w:p>
       <w:pPr>
@@ -519,7 +345,7 @@
         <w:rPr>
           <w:rFonts w:ascii="Calibri" w:hAnsi="Calibri"/>
           <w:b/>
-          <w:color w:val="3730A3"/>
+          <w:color w:val="C45C26"/>
           <w:sz w:val="20"/>
         </w:rPr>
         <w:t>Health Informatics / HMIS Officer (ICT support retained)</w:t>
@@ -553,7 +379,7 @@
       <w:r>
         <w:rPr>
           <w:rFonts w:ascii="Calibri" w:hAnsi="Calibri"/>
-          <w:color w:val="6366F1"/>
+          <w:color w:val="E8C4A8"/>
           <w:sz w:val="18"/>
         </w:rPr>
         <w:t xml:space="preserve">   |   </w:t>
@@ -577,7 +403,7 @@
         <w:rPr>
           <w:rFonts w:ascii="Calibri" w:hAnsi="Calibri"/>
           <w:b/>
-          <w:color w:val="3730A3"/>
+          <w:color w:val="C45C26"/>
         </w:rPr>
         <w:t xml:space="preserve">▪  </w:t>
       </w:r>
@@ -599,7 +425,7 @@
         <w:rPr>
           <w:rFonts w:ascii="Calibri" w:hAnsi="Calibri"/>
           <w:b/>
-          <w:color w:val="3730A3"/>
+          <w:color w:val="C45C26"/>
         </w:rPr>
         <w:t xml:space="preserve">▪  </w:t>
       </w:r>
@@ -621,7 +447,7 @@
         <w:rPr>
           <w:rFonts w:ascii="Calibri" w:hAnsi="Calibri"/>
           <w:b/>
-          <w:color w:val="3730A3"/>
+          <w:color w:val="C45C26"/>
         </w:rPr>
         <w:t xml:space="preserve">▪  </w:t>
       </w:r>
@@ -643,7 +469,7 @@
         <w:rPr>
           <w:rFonts w:ascii="Calibri" w:hAnsi="Calibri"/>
           <w:b/>
-          <w:color w:val="3730A3"/>
+          <w:color w:val="C45C26"/>
         </w:rPr>
         <w:t xml:space="preserve">▪  </w:t>
       </w:r>
@@ -665,7 +491,7 @@
         <w:rPr>
           <w:rFonts w:ascii="Calibri" w:hAnsi="Calibri"/>
           <w:b/>
-          <w:color w:val="3730A3"/>
+          <w:color w:val="C45C26"/>
         </w:rPr>
         <w:t xml:space="preserve">▪  </w:t>
       </w:r>
@@ -689,7 +515,7 @@
         <w:rPr>
           <w:rFonts w:ascii="Calibri" w:hAnsi="Calibri"/>
           <w:b/>
-          <w:color w:val="3730A3"/>
+          <w:color w:val="C45C26"/>
           <w:sz w:val="20"/>
         </w:rPr>
         <w:t>ICT Associate</w:t>
@@ -723,7 +549,7 @@
       <w:r>
         <w:rPr>
           <w:rFonts w:ascii="Calibri" w:hAnsi="Calibri"/>
-          <w:color w:val="6366F1"/>
+          <w:color w:val="E8C4A8"/>
           <w:sz w:val="18"/>
         </w:rPr>
         <w:t xml:space="preserve">   |   </w:t>
@@ -747,7 +573,7 @@
         <w:rPr>
           <w:rFonts w:ascii="Calibri" w:hAnsi="Calibri"/>
           <w:b/>
-          <w:color w:val="3730A3"/>
+          <w:color w:val="C45C26"/>
         </w:rPr>
         <w:t xml:space="preserve">▪  </w:t>
       </w:r>
@@ -769,7 +595,7 @@
         <w:rPr>
           <w:rFonts w:ascii="Calibri" w:hAnsi="Calibri"/>
           <w:b/>
-          <w:color w:val="3730A3"/>
+          <w:color w:val="C45C26"/>
         </w:rPr>
         <w:t xml:space="preserve">▪  </w:t>
       </w:r>
@@ -791,7 +617,7 @@
         <w:rPr>
           <w:rFonts w:ascii="Calibri" w:hAnsi="Calibri"/>
           <w:b/>
-          <w:color w:val="3730A3"/>
+          <w:color w:val="C45C26"/>
         </w:rPr>
         <w:t xml:space="preserve">▪  </w:t>
       </w:r>
@@ -813,7 +639,7 @@
         <w:rPr>
           <w:rFonts w:ascii="Calibri" w:hAnsi="Calibri"/>
           <w:b/>
-          <w:color w:val="3730A3"/>
+          <w:color w:val="C45C26"/>
         </w:rPr>
         <w:t xml:space="preserve">▪  </w:t>
       </w:r>
@@ -835,7 +661,7 @@
         <w:rPr>
           <w:rFonts w:ascii="Calibri" w:hAnsi="Calibri"/>
           <w:b/>
-          <w:color w:val="3730A3"/>
+          <w:color w:val="C45C26"/>
         </w:rPr>
         <w:t xml:space="preserve">▪  </w:t>
       </w:r>
@@ -857,7 +683,7 @@
         <w:rPr>
           <w:rFonts w:ascii="Calibri" w:hAnsi="Calibri"/>
           <w:b/>
-          <w:color w:val="3730A3"/>
+          <w:color w:val="C45C26"/>
         </w:rPr>
         <w:t xml:space="preserve">▪  </w:t>
       </w:r>
@@ -881,7 +707,7 @@
         <w:rPr>
           <w:rFonts w:ascii="Calibri" w:hAnsi="Calibri"/>
           <w:b/>
-          <w:color w:val="3730A3"/>
+          <w:color w:val="C45C26"/>
           <w:sz w:val="20"/>
         </w:rPr>
         <w:t>ICT Intern</w:t>
@@ -915,7 +741,7 @@
       <w:r>
         <w:rPr>
           <w:rFonts w:ascii="Calibri" w:hAnsi="Calibri"/>
-          <w:color w:val="6366F1"/>
+          <w:color w:val="E8C4A8"/>
           <w:sz w:val="18"/>
         </w:rPr>
         <w:t xml:space="preserve">   |   </w:t>
@@ -939,7 +765,7 @@
         <w:rPr>
           <w:rFonts w:ascii="Calibri" w:hAnsi="Calibri"/>
           <w:b/>
-          <w:color w:val="3730A3"/>
+          <w:color w:val="C45C26"/>
         </w:rPr>
         <w:t xml:space="preserve">▪  </w:t>
       </w:r>
@@ -961,7 +787,7 @@
         <w:rPr>
           <w:rFonts w:ascii="Calibri" w:hAnsi="Calibri"/>
           <w:b/>
-          <w:color w:val="3730A3"/>
+          <w:color w:val="C45C26"/>
         </w:rPr>
         <w:t xml:space="preserve">▪  </w:t>
       </w:r>
@@ -983,7 +809,7 @@
         <w:rPr>
           <w:rFonts w:ascii="Calibri" w:hAnsi="Calibri"/>
           <w:b/>
-          <w:color w:val="3730A3"/>
+          <w:color w:val="C45C26"/>
         </w:rPr>
         <w:t xml:space="preserve">▪  </w:t>
       </w:r>
@@ -1000,7 +826,7 @@
       <w:tblPr>
         <w:tblW w:type="auto" w:w="0"/>
         <w:tblLook w:firstColumn="1" w:firstRow="1" w:lastColumn="0" w:lastRow="0" w:noHBand="0" w:noVBand="1" w:val="04A0"/>
-        <w:tblW w:w="9849" w:type="dxa"/>
+        <w:tblW w:w="10166" w:type="dxa"/>
         <w:tblBorders>
           <w:top w:val="nil"/>
           <w:left w:val="nil"/>
@@ -1011,35 +837,121 @@
         </w:tblBorders>
       </w:tblPr>
       <w:tblGrid>
-        <w:gridCol w:w="5285"/>
-        <w:gridCol w:w="5285"/>
+        <w:gridCol w:w="173"/>
+        <w:gridCol w:w="1699"/>
+        <w:gridCol w:w="8294"/>
       </w:tblGrid>
       <w:tr>
         <w:tc>
           <w:tcPr>
-            <w:tcW w:type="dxa" w:w="173"/>
-            <w:shd w:val="clear" w:color="auto" w:fill="3730A3"/>
+            <w:tcW w:type="dxa" w:w="3581"/>
+            <w:vMerge w:val="restart"/>
+            <w:shd w:val="clear" w:color="auto" w:fill="C45C26"/>
           </w:tcPr>
           <w:p/>
         </w:tc>
         <w:tc>
           <w:tcPr>
-            <w:tcW w:type="dxa" w:w="9677"/>
-            <w:shd w:val="clear" w:color="auto" w:fill="F6F6FD"/>
+            <w:tcW w:type="dxa" w:w="3581"/>
+            <w:shd w:val="clear" w:color="auto" w:fill="FBF7F2"/>
           </w:tcPr>
           <w:p>
             <w:pPr>
-              <w:spacing w:before="100" w:after="100"/>
-              <w:ind w:left="115"/>
+              <w:spacing w:before="100" w:after="80"/>
+              <w:jc w:val="right"/>
             </w:pPr>
             <w:r>
               <w:rPr>
                 <w:rFonts w:ascii="Calibri" w:hAnsi="Calibri"/>
                 <w:b/>
-                <w:color w:val="2A2478"/>
-                <w:sz w:val="21"/>
+                <w:color w:val="C45C26"/>
+                <w:sz w:val="14"/>
               </w:rPr>
               <w:t>EDUCATION</w:t>
+            </w:r>
+          </w:p>
+        </w:tc>
+        <w:tc>
+          <w:tcPr>
+            <w:tcW w:type="dxa" w:w="3581"/>
+            <w:shd w:val="clear" w:color="auto" w:fill="FBF7F2"/>
+          </w:tcPr>
+          <w:p>
+            <w:pPr>
+              <w:spacing w:before="40" w:after="40"/>
+            </w:pPr>
+            <w:r>
+              <w:rPr>
+                <w:rFonts w:ascii="Calibri" w:hAnsi="Calibri"/>
+                <w:b/>
+                <w:color w:val="0F2744"/>
+                <w:sz w:val="20"/>
+              </w:rPr>
+              <w:t>BSc, Applied Computing  ·  KCA University, Nairobi  ·  November 2023</w:t>
+            </w:r>
+          </w:p>
+          <w:p>
+            <w:pPr>
+              <w:spacing w:before="40" w:after="40"/>
+            </w:pPr>
+            <w:r>
+              <w:rPr>
+                <w:rFonts w:ascii="Calibri" w:hAnsi="Calibri"/>
+                <w:b w:val="0"/>
+                <w:color w:val="64748B"/>
+                <w:sz w:val="16"/>
+              </w:rPr>
+              <w:t>Cybersecurity and Digital Forensics. Coursework: Ethical Hacking, Digital Forensics, Data Protection, Cloud Computing. Capstone: designed and implemented a secure office network (VLANs, Active Directory, backup and disaster recovery).</w:t>
+            </w:r>
+          </w:p>
+        </w:tc>
+      </w:tr>
+      <w:tr>
+        <w:tc>
+          <w:tcPr>
+            <w:tcW w:type="dxa" w:w="3581"/>
+            <w:vMerge/>
+          </w:tcPr>
+          <w:p/>
+        </w:tc>
+        <w:tc>
+          <w:tcPr>
+            <w:tcW w:type="dxa" w:w="3581"/>
+            <w:shd w:val="clear" w:color="auto" w:fill="FBF7F2"/>
+          </w:tcPr>
+          <w:p>
+            <w:pPr>
+              <w:spacing w:before="100" w:after="80"/>
+              <w:jc w:val="right"/>
+            </w:pPr>
+            <w:r>
+              <w:rPr>
+                <w:rFonts w:ascii="Calibri" w:hAnsi="Calibri"/>
+                <w:b/>
+                <w:color w:val="C45C26"/>
+                <w:sz w:val="14"/>
+              </w:rPr>
+              <w:t>CERTIFICATIONS</w:t>
+            </w:r>
+          </w:p>
+        </w:tc>
+        <w:tc>
+          <w:tcPr>
+            <w:tcW w:type="dxa" w:w="3581"/>
+            <w:shd w:val="clear" w:color="auto" w:fill="FBF7F2"/>
+          </w:tcPr>
+          <w:p>
+            <w:pPr>
+              <w:spacing w:before="40" w:after="40"/>
+            </w:pPr>
+            <w:r>
+              <w:rPr>
+                <w:rFonts w:ascii="Calibri" w:hAnsi="Calibri"/>
+                <w:b w:val="0"/>
+                <w:color w:val="1E293B"/>
+                <w:sz w:val="18"/>
+              </w:rPr>
+              <w:t>CCNA  ·  Microsoft Azure Fundamentals (AZ-900)  ·  Google IT Support  ·  IBM Technical Support  ·  GitHub Professional  ·  Microsoft Data Analysis</w:t>
             </w:r>
           </w:p>
         </w:tc>
@@ -1047,181 +959,25 @@
     </w:tbl>
     <w:p>
       <w:pPr>
-        <w:spacing w:before="0" w:after="120"/>
-        <w:pBdr>
-          <w:bottom w:val="single" w:sz="4" w:space="1" w:color="6366F1"/>
-        </w:pBdr>
+        <w:spacing w:before="120" w:after="40"/>
       </w:pPr>
     </w:p>
     <w:p>
       <w:pPr>
-        <w:spacing w:after="20"/>
+        <w:spacing w:before="160" w:after="20"/>
+        <w:pBdr>
+          <w:bottom w:val="single" w:sz="12" w:space="1" w:color="C45C26"/>
+        </w:pBdr>
       </w:pPr>
       <w:r>
         <w:rPr>
           <w:rFonts w:ascii="Calibri" w:hAnsi="Calibri"/>
           <w:b/>
-          <w:color w:val="1E293B"/>
-          <w:sz w:val="20"/>
+          <w:color w:val="0F2744"/>
+          <w:sz w:val="18"/>
         </w:rPr>
-        <w:t>BSc, Applied Computing  |  KCA University, Nairobi  |  November 2023</w:t>
+        <w:t>SELECTED RESULTS</w:t>
       </w:r>
-    </w:p>
-    <w:p>
-      <w:pPr>
-        <w:spacing w:after="60"/>
-      </w:pPr>
-      <w:r>
-        <w:rPr>
-          <w:rFonts w:ascii="Calibri" w:hAnsi="Calibri"/>
-          <w:b w:val="0"/>
-          <w:color w:val="64748B"/>
-          <w:sz w:val="19"/>
-        </w:rPr>
-        <w:t>Specialized in Cybersecurity and Digital Forensics. Coursework included Ethical Hacking, Digital Forensics, Data Protection, and Cloud Computing.</w:t>
-      </w:r>
-    </w:p>
-    <w:p>
-      <w:pPr>
-        <w:spacing w:after="60"/>
-      </w:pPr>
-      <w:r>
-        <w:rPr>
-          <w:rFonts w:ascii="Calibri" w:hAnsi="Calibri"/>
-          <w:b w:val="0"/>
-          <w:color w:val="64748B"/>
-          <w:sz w:val="19"/>
-        </w:rPr>
-        <w:t>Capstone: Designed and implemented a secure office network (VLANs, Active Directory, backup/DR) simulating real-world IT administration.</w:t>
-      </w:r>
-    </w:p>
-    <w:tbl>
-      <w:tblPr>
-        <w:tblW w:type="auto" w:w="0"/>
-        <w:tblLook w:firstColumn="1" w:firstRow="1" w:lastColumn="0" w:lastRow="0" w:noHBand="0" w:noVBand="1" w:val="04A0"/>
-        <w:tblW w:w="9849" w:type="dxa"/>
-        <w:tblBorders>
-          <w:top w:val="nil"/>
-          <w:left w:val="nil"/>
-          <w:bottom w:val="nil"/>
-          <w:right w:val="nil"/>
-          <w:insideH w:val="nil"/>
-          <w:insideV w:val="nil"/>
-        </w:tblBorders>
-      </w:tblPr>
-      <w:tblGrid>
-        <w:gridCol w:w="5285"/>
-        <w:gridCol w:w="5285"/>
-      </w:tblGrid>
-      <w:tr>
-        <w:tc>
-          <w:tcPr>
-            <w:tcW w:type="dxa" w:w="173"/>
-            <w:shd w:val="clear" w:color="auto" w:fill="3730A3"/>
-          </w:tcPr>
-          <w:p/>
-        </w:tc>
-        <w:tc>
-          <w:tcPr>
-            <w:tcW w:type="dxa" w:w="9677"/>
-            <w:shd w:val="clear" w:color="auto" w:fill="F6F6FD"/>
-          </w:tcPr>
-          <w:p>
-            <w:pPr>
-              <w:spacing w:before="100" w:after="100"/>
-              <w:ind w:left="115"/>
-            </w:pPr>
-            <w:r>
-              <w:rPr>
-                <w:rFonts w:ascii="Calibri" w:hAnsi="Calibri"/>
-                <w:b/>
-                <w:color w:val="2A2478"/>
-                <w:sz w:val="21"/>
-              </w:rPr>
-              <w:t>CERTIFICATIONS</w:t>
-            </w:r>
-          </w:p>
-        </w:tc>
-      </w:tr>
-    </w:tbl>
-    <w:p>
-      <w:pPr>
-        <w:spacing w:before="0" w:after="120"/>
-        <w:pBdr>
-          <w:bottom w:val="single" w:sz="4" w:space="1" w:color="6366F1"/>
-        </w:pBdr>
-      </w:pPr>
-    </w:p>
-    <w:p>
-      <w:pPr>
-        <w:spacing w:after="60"/>
-      </w:pPr>
-      <w:r>
-        <w:rPr>
-          <w:rFonts w:ascii="Calibri" w:hAnsi="Calibri"/>
-          <w:b w:val="0"/>
-          <w:color w:val="1E293B"/>
-          <w:sz w:val="20"/>
-        </w:rPr>
-        <w:t>CCNA  |  Microsoft Azure Fundamentals (AZ-900)  |  Google IT Support  |  IBM Technical Support  |  GitHub Professional  |  Microsoft Data Analysis</w:t>
-      </w:r>
-    </w:p>
-    <w:tbl>
-      <w:tblPr>
-        <w:tblW w:type="auto" w:w="0"/>
-        <w:tblLook w:firstColumn="1" w:firstRow="1" w:lastColumn="0" w:lastRow="0" w:noHBand="0" w:noVBand="1" w:val="04A0"/>
-        <w:tblW w:w="9849" w:type="dxa"/>
-        <w:tblBorders>
-          <w:top w:val="nil"/>
-          <w:left w:val="nil"/>
-          <w:bottom w:val="nil"/>
-          <w:right w:val="nil"/>
-          <w:insideH w:val="nil"/>
-          <w:insideV w:val="nil"/>
-        </w:tblBorders>
-      </w:tblPr>
-      <w:tblGrid>
-        <w:gridCol w:w="5285"/>
-        <w:gridCol w:w="5285"/>
-      </w:tblGrid>
-      <w:tr>
-        <w:tc>
-          <w:tcPr>
-            <w:tcW w:type="dxa" w:w="173"/>
-            <w:shd w:val="clear" w:color="auto" w:fill="3730A3"/>
-          </w:tcPr>
-          <w:p/>
-        </w:tc>
-        <w:tc>
-          <w:tcPr>
-            <w:tcW w:type="dxa" w:w="9677"/>
-            <w:shd w:val="clear" w:color="auto" w:fill="F6F6FD"/>
-          </w:tcPr>
-          <w:p>
-            <w:pPr>
-              <w:spacing w:before="100" w:after="100"/>
-              <w:ind w:left="115"/>
-            </w:pPr>
-            <w:r>
-              <w:rPr>
-                <w:rFonts w:ascii="Calibri" w:hAnsi="Calibri"/>
-                <w:b/>
-                <w:color w:val="2A2478"/>
-                <w:sz w:val="21"/>
-              </w:rPr>
-              <w:t>ACHIEVEMENTS &amp; ACTIVITIES</w:t>
-            </w:r>
-          </w:p>
-        </w:tc>
-      </w:tr>
-    </w:tbl>
-    <w:p>
-      <w:pPr>
-        <w:spacing w:before="0" w:after="120"/>
-        <w:pBdr>
-          <w:bottom w:val="single" w:sz="4" w:space="1" w:color="6366F1"/>
-        </w:pBdr>
-      </w:pPr>
     </w:p>
     <w:p>
       <w:pPr>
@@ -1232,7 +988,7 @@
         <w:rPr>
           <w:rFonts w:ascii="Calibri" w:hAnsi="Calibri"/>
           <w:b/>
-          <w:color w:val="3730A3"/>
+          <w:color w:val="C45C26"/>
         </w:rPr>
         <w:t xml:space="preserve">▪  </w:t>
       </w:r>
@@ -1254,7 +1010,7 @@
         <w:rPr>
           <w:rFonts w:ascii="Calibri" w:hAnsi="Calibri"/>
           <w:b/>
-          <w:color w:val="3730A3"/>
+          <w:color w:val="C45C26"/>
         </w:rPr>
         <w:t xml:space="preserve">▪  </w:t>
       </w:r>
@@ -1276,7 +1032,7 @@
         <w:rPr>
           <w:rFonts w:ascii="Calibri" w:hAnsi="Calibri"/>
           <w:b/>
-          <w:color w:val="3730A3"/>
+          <w:color w:val="C45C26"/>
         </w:rPr>
         <w:t xml:space="preserve">▪  </w:t>
       </w:r>
@@ -1298,7 +1054,7 @@
         <w:rPr>
           <w:rFonts w:ascii="Calibri" w:hAnsi="Calibri"/>
           <w:b/>
-          <w:color w:val="3730A3"/>
+          <w:color w:val="C45C26"/>
         </w:rPr>
         <w:t xml:space="preserve">▪  </w:t>
       </w:r>
@@ -1311,62 +1067,22 @@
         <w:t>Cybersecurity hackathon participant (Cyberise / CA Kenya; NRF), reinforcing security-awareness mindset.</w:t>
       </w:r>
     </w:p>
-    <w:tbl>
-      <w:tblPr>
-        <w:tblW w:type="auto" w:w="0"/>
-        <w:tblLook w:firstColumn="1" w:firstRow="1" w:lastColumn="0" w:lastRow="0" w:noHBand="0" w:noVBand="1" w:val="04A0"/>
-        <w:tblW w:w="9849" w:type="dxa"/>
-        <w:tblBorders>
-          <w:top w:val="nil"/>
-          <w:left w:val="nil"/>
-          <w:bottom w:val="nil"/>
-          <w:right w:val="nil"/>
-          <w:insideH w:val="nil"/>
-          <w:insideV w:val="nil"/>
-        </w:tblBorders>
-      </w:tblPr>
-      <w:tblGrid>
-        <w:gridCol w:w="5285"/>
-        <w:gridCol w:w="5285"/>
-      </w:tblGrid>
-      <w:tr>
-        <w:tc>
-          <w:tcPr>
-            <w:tcW w:type="dxa" w:w="173"/>
-            <w:shd w:val="clear" w:color="auto" w:fill="3730A3"/>
-          </w:tcPr>
-          <w:p/>
-        </w:tc>
-        <w:tc>
-          <w:tcPr>
-            <w:tcW w:type="dxa" w:w="9677"/>
-            <w:shd w:val="clear" w:color="auto" w:fill="F6F6FD"/>
-          </w:tcPr>
-          <w:p>
-            <w:pPr>
-              <w:spacing w:before="100" w:after="100"/>
-              <w:ind w:left="115"/>
-            </w:pPr>
-            <w:r>
-              <w:rPr>
-                <w:rFonts w:ascii="Calibri" w:hAnsi="Calibri"/>
-                <w:b/>
-                <w:color w:val="2A2478"/>
-                <w:sz w:val="21"/>
-              </w:rPr>
-              <w:t>REFEREES</w:t>
-            </w:r>
-          </w:p>
-        </w:tc>
-      </w:tr>
-    </w:tbl>
     <w:p>
       <w:pPr>
-        <w:spacing w:before="0" w:after="120"/>
+        <w:spacing w:before="160" w:after="20"/>
         <w:pBdr>
-          <w:bottom w:val="single" w:sz="4" w:space="1" w:color="6366F1"/>
+          <w:bottom w:val="single" w:sz="12" w:space="1" w:color="C45C26"/>
         </w:pBdr>
       </w:pPr>
+      <w:r>
+        <w:rPr>
+          <w:rFonts w:ascii="Calibri" w:hAnsi="Calibri"/>
+          <w:b/>
+          <w:color w:val="0F2744"/>
+          <w:sz w:val="18"/>
+        </w:rPr>
+        <w:t>REFEREES</w:t>
+      </w:r>
     </w:p>
     <w:p>
       <w:pPr>
@@ -1412,7 +1128,7 @@
     </w:p>
     <w:sectPr>
       <w:pgSz w:w="12240" w:h="15840"/>
-      <w:pgMar w:top="691" w:right="835" w:bottom="691" w:left="835" w:header="720" w:footer="720" w:gutter="0"/>
+      <w:pgMar w:top="576" w:right="749" w:bottom="605" w:left="749" w:header="720" w:footer="720" w:gutter="0"/>
       <w:cols w:space="720"/>
       <w:docGrid w:linePitch="360"/>
     </w:sectPr>

</xml_diff>